<commit_message>
feat(api): impl export templates api
</commit_message>
<xml_diff>
--- a/apps/api/templates/dynamic-docx-template.docx
+++ b/apps/api/templates/dynamic-docx-template.docx
@@ -1,6 +1,6 @@
 
 <file path=word/document.xml><?xml version="1.0" encoding="utf-8"?>
-<w:document xmlns:wpc="http://schemas.microsoft.com/office/word/2010/wordprocessingCanvas" xmlns:cx="http://schemas.microsoft.com/office/drawing/2014/chartex" xmlns:cx1="http://schemas.microsoft.com/office/drawing/2015/9/8/chartex" xmlns:cx2="http://schemas.microsoft.com/office/drawing/2015/10/21/chartex" xmlns:cx3="http://schemas.microsoft.com/office/drawing/2016/5/9/chartex" xmlns:cx4="http://schemas.microsoft.com/office/drawing/2016/5/10/chartex" xmlns:cx5="http://schemas.microsoft.com/office/drawing/2016/5/11/chartex" xmlns:cx6="http://schemas.microsoft.com/office/drawing/2016/5/12/chartex" xmlns:cx7="http://schemas.microsoft.com/office/drawing/2016/5/13/chartex" xmlns:cx8="http://schemas.microsoft.com/office/drawing/2016/5/14/chartex" xmlns:mc="http://schemas.openxmlformats.org/markup-compatibility/2006" xmlns:aink="http://schemas.microsoft.com/office/drawing/2016/ink" xmlns:am3d="http://schemas.microsoft.com/office/drawing/2017/model3d" xmlns:o="urn:schemas-microsoft-com:office:office" xmlns:oel="http://schemas.microsoft.com/office/2019/extlst" xmlns:r="http://schemas.openxmlformats.org/officeDocument/2006/relationships" xmlns:m="http://schemas.openxmlformats.org/officeDocument/2006/math" xmlns:v="urn:schemas-microsoft-com:vml" xmlns:wp14="http://schemas.microsoft.com/office/word/2010/wordprocessingDrawing" xmlns:wp="http://schemas.openxmlformats.org/drawingml/2006/wordprocessingDrawing" xmlns:w10="urn:schemas-microsoft-com:office:word" xmlns:w="http://schemas.openxmlformats.org/wordprocessingml/2006/main" xmlns:w14="http://schemas.microsoft.com/office/word/2010/wordml" xmlns:w15="http://schemas.microsoft.com/office/word/2012/wordml" xmlns:w16cex="http://schemas.microsoft.com/office/word/2018/wordml/cex" xmlns:w16cid="http://schemas.microsoft.com/office/word/2016/wordml/cid" xmlns:w16="http://schemas.microsoft.com/office/word/2018/wordml" xmlns:w16du="http://schemas.microsoft.com/office/word/2023/wordml/word16du" xmlns:w16sdtdh="http://schemas.microsoft.com/office/word/2020/wordml/sdtdatahash" xmlns:w16sdtfl="http://schemas.microsoft.com/office/word/2024/wordml/sdtformatlock" xmlns:w16se="http://schemas.microsoft.com/office/word/2015/wordml/symex" xmlns:wpg="http://schemas.microsoft.com/office/word/2010/wordprocessingGroup" xmlns:wpi="http://schemas.microsoft.com/office/word/2010/wordprocessingInk" xmlns:wne="http://schemas.microsoft.com/office/word/2006/wordml" xmlns:wps="http://schemas.microsoft.com/office/word/2010/wordprocessingShape" mc:Ignorable="w14 w15 w16se w16cid w16 w16cex w16sdtdh w16sdtfl w16du wp14">
+<w:document xmlns:wpc="http://schemas.microsoft.com/office/word/2010/wordprocessingCanvas" xmlns:cx="http://schemas.microsoft.com/office/drawing/2014/chartex" xmlns:cx1="http://schemas.microsoft.com/office/drawing/2015/9/8/chartex" xmlns:cx2="http://schemas.microsoft.com/office/drawing/2015/10/21/chartex" xmlns:cx3="http://schemas.microsoft.com/office/drawing/2016/5/9/chartex" xmlns:cx4="http://schemas.microsoft.com/office/drawing/2016/5/10/chartex" xmlns:cx5="http://schemas.microsoft.com/office/drawing/2016/5/11/chartex" xmlns:cx6="http://schemas.microsoft.com/office/drawing/2016/5/12/chartex" xmlns:cx7="http://schemas.microsoft.com/office/drawing/2016/5/13/chartex" xmlns:cx8="http://schemas.microsoft.com/office/drawing/2016/5/14/chartex" xmlns:mc="http://schemas.openxmlformats.org/markup-compatibility/2006" xmlns:aink="http://schemas.microsoft.com/office/drawing/2016/ink" xmlns:am3d="http://schemas.microsoft.com/office/drawing/2017/model3d" xmlns:o="urn:schemas-microsoft-com:office:office" xmlns:oel="http://schemas.microsoft.com/office/2019/extlst" xmlns:r="http://schemas.openxmlformats.org/officeDocument/2006/relationships" xmlns:m="http://schemas.openxmlformats.org/officeDocument/2006/math" xmlns:v="urn:schemas-microsoft-com:vml" xmlns:wp14="http://schemas.microsoft.com/office/word/2010/wordprocessingDrawing" xmlns:wp="http://schemas.openxmlformats.org/drawingml/2006/wordprocessingDrawing" xmlns:w10="urn:schemas-microsoft-com:office:word" xmlns:w="http://schemas.openxmlformats.org/wordprocessingml/2006/main" xmlns:w14="http://schemas.microsoft.com/office/word/2010/wordml" xmlns:w15="http://schemas.microsoft.com/office/word/2012/wordml" xmlns:w16cex="http://schemas.microsoft.com/office/word/2018/wordml/cex" xmlns:w16cid="http://schemas.microsoft.com/office/word/2016/wordml/cid" xmlns:w16="http://schemas.microsoft.com/office/word/2018/wordml" xmlns:w16du="http://schemas.microsoft.com/office/word/2023/wordml/word16du" xmlns:w16sdtdh="http://schemas.microsoft.com/office/word/2020/wordml/sdtdatahash" xmlns:w16sdtfl="http://schemas.microsoft.com/office/word/2024/wordml/sdtformatlock" xmlns:w16se="http://schemas.microsoft.com/office/word/2015/wordml/symex" xmlns:wpg="http://schemas.microsoft.com/office/word/2010/wordprocessingGroup" xmlns:wpi="http://schemas.microsoft.com/office/word/2010/wordprocessingInk" xmlns:wne="http://schemas.microsoft.com/office/word/2006/wordml" xmlns:wps="http://schemas.microsoft.com/office/word/2010/wordprocessingShape" xmlns:a="http://schemas.openxmlformats.org/drawingml/2006/main" xmlns:pic="http://schemas.openxmlformats.org/drawingml/2006/picture" mc:Ignorable="w14 w15 w16se w16cid w16 w16cex w16sdtdh w16sdtfl w16du wp14">
   <w:body>
     <w:p>
       <w:pPr>
@@ -14,7 +14,7 @@
         </w:pBdr>
         <w:spacing w:line="276" w:lineRule="auto"/>
         <w:rPr>
-          <w:rFonts w:ascii="Arial" w:eastAsia="Arial" w:hAnsi="Arial" w:cs="Arial"/>
+          <w:rFonts w:ascii="Arial" w:hAnsi="Arial" w:eastAsia="Arial" w:cs="Arial"/>
           <w:b w:val="0"/>
           <w:color w:val="000000"/>
           <w:sz w:val="22"/>
@@ -24,8 +24,7 @@
     </w:p>
     <w:tbl>
       <w:tblPr>
-        <w:tblStyle w:val="a"/>
-        <w:tblW w:w="9639" w:type="dxa"/>
+        <w:tblW w:w="14564" w:type="dxa"/>
         <w:tblInd w:w="-284" w:type="dxa"/>
         <w:tblBorders>
           <w:top w:val="nil"/>
@@ -39,28 +38,34 @@
         <w:tblLook w:val="0400" w:firstRow="0" w:lastRow="0" w:firstColumn="0" w:lastColumn="0" w:noHBand="0" w:noVBand="1"/>
       </w:tblPr>
       <w:tblGrid>
-        <w:gridCol w:w="2269"/>
-        <w:gridCol w:w="7370"/>
+        <w:gridCol w:w="3922"/>
+        <w:gridCol w:w="3922"/>
+        <w:gridCol w:w="6720"/>
       </w:tblGrid>
       <w:tr>
         <w:tc>
           <w:tcPr>
-            <w:tcW w:w="2269" w:type="dxa"/>
+            <w:tcW w:w="3922" w:type="dxa"/>
+            <w:tcMar/>
           </w:tcPr>
           <w:p>
             <w:pPr>
               <w:jc w:val="center"/>
               <w:rPr>
                 <w:b w:val="0"/>
-                <w:sz w:val="26"/>
-                <w:szCs w:val="26"/>
+                <w:bCs w:val="0"/>
+                <w:sz w:val="26"/>
+                <w:szCs w:val="26"/>
+                <w:lang w:val="en-US"/>
               </w:rPr>
             </w:pPr>
             <w:r>
               <w:rPr>
                 <w:b w:val="0"/>
-                <w:sz w:val="26"/>
-                <w:szCs w:val="26"/>
+                <w:bCs w:val="0"/>
+                <w:sz w:val="26"/>
+                <w:szCs w:val="26"/>
+                <w:lang w:val="en-US"/>
               </w:rPr>
               <w:t>{unitName}</w:t>
             </w:r>
@@ -68,6 +73,7 @@
               <w:rPr>
                 <w:sz w:val="26"/>
                 <w:szCs w:val="26"/>
+                <w:lang w:val="en-US"/>
               </w:rPr>
               <w:t xml:space="preserve"> </w:t>
             </w:r>
@@ -78,14 +84,17 @@
               <w:jc w:val="center"/>
               <w:rPr>
                 <w:b w:val="0"/>
-                <w:sz w:val="26"/>
-                <w:szCs w:val="26"/>
+                <w:bCs w:val="0"/>
+                <w:sz w:val="26"/>
+                <w:szCs w:val="26"/>
+                <w:lang w:val="en-US"/>
               </w:rPr>
             </w:pPr>
             <w:r>
               <w:rPr>
                 <w:sz w:val="26"/>
                 <w:szCs w:val="26"/>
+                <w:lang w:val="en-US"/>
               </w:rPr>
               <w:t>{underUnitName}</w:t>
             </w:r>
@@ -147,12 +156,12 @@
                 </mc:Choice>
                 <mc:Fallback>
                   <w:pict>
-                    <v:shapetype w14:anchorId="76D7E314" id="_x0000_t32" coordsize="21600,21600" o:spt="32" o:oned="t" path="m,l21600,21600e" filled="f">
-                      <v:path arrowok="t" fillok="f" o:connecttype="none"/>
+                    <v:shapetype id="_x0000_t32" coordsize="21600,21600" o:oned="t" filled="f" o:spt="32" path="m,l21600,21600e" w14:anchorId="76D7E314">
+                      <v:path fillok="f" arrowok="t" o:connecttype="none"/>
                       <o:lock v:ext="edit" shapetype="t"/>
                     </v:shapetype>
-                    <v:shape id="Straight Arrow Connector 2" o:spid="_x0000_s1026" type="#_x0000_t32" style="position:absolute;margin-left:26.5pt;margin-top:17.45pt;width:45pt;height:0;z-index:251658240;visibility:visible;mso-wrap-style:square;mso-width-percent:0;mso-height-percent:0;mso-wrap-distance-left:9pt;mso-wrap-distance-top:0;mso-wrap-distance-right:9pt;mso-wrap-distance-bottom:0;mso-position-horizontal:absolute;mso-position-horizontal-relative:text;mso-position-vertical:absolute;mso-position-vertical-relative:text;mso-width-percent:0;mso-height-percent:0;mso-width-relative:margin;mso-height-relative:margin" o:gfxdata="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" strokecolor="black [3200]">
-                      <v:stroke startarrowwidth="narrow" startarrowlength="short" endarrowwidth="narrow" endarrowlength="short" joinstyle="miter"/>
+                    <v:shape id="Straight Arrow Connector 2" style="position:absolute;margin-left:26.5pt;margin-top:17.45pt;width:45pt;height:0;z-index:251658240;visibility:visible;mso-wrap-style:square;mso-width-percent:0;mso-height-percent:0;mso-wrap-distance-left:9pt;mso-wrap-distance-top:0;mso-wrap-distance-right:9pt;mso-wrap-distance-bottom:0;mso-position-horizontal:absolute;mso-position-horizontal-relative:text;mso-position-vertical:absolute;mso-position-vertical-relative:text;mso-width-percent:0;mso-height-percent:0;mso-width-relative:margin;mso-height-relative:margin" o:spid="_x0000_s1026" strokecolor="black [3200]" type="#_x0000_t32" o:gfxdata="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">
+                      <v:stroke joinstyle="miter" startarrowwidth="narrow" startarrowlength="short" endarrowwidth="narrow" endarrowlength="short"/>
                     </v:shape>
                   </w:pict>
                 </mc:Fallback>
@@ -162,7 +171,27 @@
         </w:tc>
         <w:tc>
           <w:tcPr>
-            <w:tcW w:w="7370" w:type="dxa"/>
+            <w:tcW w:w="3922" w:type="dxa"/>
+            <w:tcMar/>
+          </w:tcPr>
+          <w:p>
+            <w:pPr>
+              <w:pStyle w:val="Normal"/>
+              <w:jc w:val="center"/>
+              <w:rPr>
+                <w:b w:val="0"/>
+                <w:bCs w:val="0"/>
+                <w:sz w:val="26"/>
+                <w:szCs w:val="26"/>
+                <w:lang w:val="en-US"/>
+              </w:rPr>
+            </w:pPr>
+          </w:p>
+        </w:tc>
+        <w:tc>
+          <w:tcPr>
+            <w:tcW w:w="6720" w:type="dxa"/>
+            <w:tcMar/>
           </w:tcPr>
           <w:p>
             <w:pPr>
@@ -187,12 +216,14 @@
               <w:rPr>
                 <w:sz w:val="26"/>
                 <w:szCs w:val="26"/>
+                <w:lang w:val="en-US"/>
               </w:rPr>
             </w:pPr>
             <w:r>
               <w:rPr>
                 <w:sz w:val="26"/>
                 <w:szCs w:val="26"/>
+                <w:lang w:val="en-US"/>
               </w:rPr>
               <w:t>Độc lập – Tự do – Hạnh phúc</w:t>
             </w:r>
@@ -251,8 +282,8 @@
                 </mc:Choice>
                 <mc:Fallback>
                   <w:pict>
-                    <v:shape w14:anchorId="717B003D" id="Straight Arrow Connector 1" o:spid="_x0000_s1026" type="#_x0000_t32" style="position:absolute;margin-left:93.4pt;margin-top:17.35pt;width:170.9pt;height:0;z-index:251659264;visibility:visible;mso-wrap-style:square;mso-height-percent:0;mso-wrap-distance-left:9pt;mso-wrap-distance-top:0;mso-wrap-distance-right:9pt;mso-wrap-distance-bottom:0;mso-position-horizontal:absolute;mso-position-horizontal-relative:text;mso-position-vertical:absolute;mso-position-vertical-relative:text;mso-height-percent:0;mso-height-relative:margin" o:gfxdata="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" strokecolor="black [3200]">
-                      <v:stroke startarrowwidth="narrow" startarrowlength="short" endarrowwidth="narrow" endarrowlength="short" joinstyle="miter"/>
+                    <v:shape id="Straight Arrow Connector 1" style="position:absolute;margin-left:93.4pt;margin-top:17.35pt;width:170.9pt;height:0;z-index:251659264;visibility:visible;mso-wrap-style:square;mso-height-percent:0;mso-wrap-distance-left:9pt;mso-wrap-distance-top:0;mso-wrap-distance-right:9pt;mso-wrap-distance-bottom:0;mso-position-horizontal:absolute;mso-position-horizontal-relative:text;mso-position-vertical:absolute;mso-position-vertical-relative:text;mso-height-percent:0;mso-height-relative:margin" o:spid="_x0000_s1026" strokecolor="black [3200]" type="#_x0000_t32" o:gfxdata="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" w14:anchorId="717B003D">
+                      <v:stroke joinstyle="miter" startarrowwidth="narrow" startarrowlength="short" endarrowwidth="narrow" endarrowlength="short"/>
                     </v:shape>
                   </w:pict>
                 </mc:Fallback>
@@ -264,7 +295,8 @@
       <w:tr>
         <w:tc>
           <w:tcPr>
-            <w:tcW w:w="2269" w:type="dxa"/>
+            <w:tcW w:w="3922" w:type="dxa"/>
+            <w:tcMar/>
           </w:tcPr>
           <w:p>
             <w:pPr>
@@ -277,7 +309,23 @@
         </w:tc>
         <w:tc>
           <w:tcPr>
-            <w:tcW w:w="7370" w:type="dxa"/>
+            <w:tcW w:w="3922" w:type="dxa"/>
+            <w:tcMar/>
+          </w:tcPr>
+          <w:p>
+            <w:pPr>
+              <w:pStyle w:val="Normal"/>
+              <w:rPr>
+                <w:sz w:val="26"/>
+                <w:szCs w:val="26"/>
+              </w:rPr>
+            </w:pPr>
+          </w:p>
+        </w:tc>
+        <w:tc>
+          <w:tcPr>
+            <w:tcW w:w="6720" w:type="dxa"/>
+            <w:tcMar/>
           </w:tcPr>
           <w:p>
             <w:pPr>
@@ -285,17 +333,23 @@
               <w:jc w:val="center"/>
               <w:rPr>
                 <w:b w:val="0"/>
-                <w:i/>
-                <w:sz w:val="26"/>
-                <w:szCs w:val="26"/>
+                <w:bCs w:val="0"/>
+                <w:i w:val="1"/>
+                <w:iCs w:val="1"/>
+                <w:sz w:val="26"/>
+                <w:szCs w:val="26"/>
+                <w:lang w:val="en-US"/>
               </w:rPr>
             </w:pPr>
             <w:r>
               <w:rPr>
                 <w:b w:val="0"/>
-                <w:i/>
-                <w:sz w:val="26"/>
-                <w:szCs w:val="26"/>
+                <w:bCs w:val="0"/>
+                <w:i w:val="1"/>
+                <w:iCs w:val="1"/>
+                <w:sz w:val="26"/>
+                <w:szCs w:val="26"/>
+                <w:lang w:val="en-US"/>
               </w:rPr>
               <w:t>{city}, ngày {day} tháng {month} năm {year}</w:t>
             </w:r>
@@ -309,6 +363,9 @@
         <w:jc w:val="center"/>
       </w:pPr>
       <w:r>
+        <w:rPr>
+          <w:lang w:val="en-US"/>
+        </w:rPr>
         <w:t>{reportTitle}</w:t>
       </w:r>
       <w:r>
@@ -363,7 +420,7 @@
           </mc:Choice>
           <mc:Fallback xmlns:cr="http://schemas.microsoft.com/office/comments/2020/reactions" xmlns="http://schemas.microsoft.com/office/tasks/2019/documenttasks" xmlns:dgm="http://schemas.openxmlformats.org/drawingml/2006/diagram" xmlns:lc="http://schemas.openxmlformats.org/drawingml/2006/lockedCanvas" xmlns:c="http://schemas.openxmlformats.org/drawingml/2006/chart" xmlns:pic="http://schemas.openxmlformats.org/drawingml/2006/picture" xmlns:a="http://schemas.openxmlformats.org/drawingml/2006/main" xmlns:sl="http://schemas.openxmlformats.org/schemaLibrary/2006/main">
             <w:drawing>
-              <wp:anchor allowOverlap="1" behindDoc="0" distB="0" distT="0" distL="114300" distR="114300" hidden="0" layoutInCell="1" locked="0" relativeHeight="0" simplePos="0">
+              <wp:anchor distT="0" distB="0" distL="114300" distR="114300" simplePos="0" relativeHeight="0" behindDoc="0" locked="0" layoutInCell="1" hidden="0" allowOverlap="1">
                 <wp:simplePos x="0" y="0"/>
                 <wp:positionH relativeFrom="column">
                   <wp:posOffset>2434861</wp:posOffset>
@@ -372,7 +429,7 @@
                   <wp:posOffset>451667</wp:posOffset>
                 </wp:positionV>
                 <wp:extent cx="957943" cy="12700"/>
-                <wp:effectExtent b="0" l="0" r="0" t="0"/>
+                <wp:effectExtent l="0" t="0" r="0" b="0"/>
                 <wp:wrapNone/>
                 <wp:docPr id="3" name="image3.png"/>
                 <a:graphic>
@@ -417,29 +474,28 @@
     </w:p>
     <w:tbl>
       <w:tblPr>
-        <w:tblStyle w:val="a0"/>
-        <w:tblW w:w="9355" w:type="dxa"/>
+        <w:tblW w:w="13797" w:type="dxa"/>
         <w:tblInd w:w="0" w:type="dxa"/>
         <w:tblBorders>
-          <w:top w:val="single" w:sz="8" w:space="0" w:color="000000"/>
-          <w:left w:val="single" w:sz="8" w:space="0" w:color="000000"/>
-          <w:bottom w:val="single" w:sz="8" w:space="0" w:color="000000"/>
-          <w:right w:val="single" w:sz="8" w:space="0" w:color="000000"/>
-          <w:insideH w:val="single" w:sz="8" w:space="0" w:color="000000"/>
-          <w:insideV w:val="single" w:sz="8" w:space="0" w:color="000000"/>
+          <w:top w:val="single" w:color="000000" w:themeColor="text1" w:sz="8" w:space="0"/>
+          <w:left w:val="single" w:color="000000" w:themeColor="text1" w:sz="8" w:space="0"/>
+          <w:bottom w:val="single" w:color="000000" w:themeColor="text1" w:sz="8" w:space="0"/>
+          <w:right w:val="single" w:color="000000" w:themeColor="text1" w:sz="8" w:space="0"/>
+          <w:insideH w:val="single" w:color="000000" w:themeColor="text1" w:sz="8" w:space="0"/>
+          <w:insideV w:val="single" w:color="000000" w:themeColor="text1" w:sz="8" w:space="0"/>
         </w:tblBorders>
         <w:tblLayout w:type="fixed"/>
         <w:tblLook w:val="0600" w:firstRow="0" w:lastRow="0" w:firstColumn="0" w:lastColumn="0" w:noHBand="1" w:noVBand="1"/>
       </w:tblPr>
       <w:tblGrid>
-        <w:gridCol w:w="3119"/>
-        <w:gridCol w:w="3118"/>
-        <w:gridCol w:w="3118"/>
+        <w:gridCol w:w="4350"/>
+        <w:gridCol w:w="5879"/>
+        <w:gridCol w:w="3568"/>
       </w:tblGrid>
       <w:tr>
         <w:tc>
           <w:tcPr>
-            <w:tcW w:w="3118" w:type="dxa"/>
+            <w:tcW w:w="4350" w:type="dxa"/>
             <w:tcMar>
               <w:top w:w="100" w:type="dxa"/>
               <w:left w:w="100" w:type="dxa"/>
@@ -475,7 +531,7 @@
         </w:tc>
         <w:tc>
           <w:tcPr>
-            <w:tcW w:w="3118" w:type="dxa"/>
+            <w:tcW w:w="5879" w:type="dxa"/>
             <w:tcMar>
               <w:top w:w="100" w:type="dxa"/>
               <w:left w:w="100" w:type="dxa"/>
@@ -511,7 +567,7 @@
         </w:tc>
         <w:tc>
           <w:tcPr>
-            <w:tcW w:w="3118" w:type="dxa"/>
+            <w:tcW w:w="3568" w:type="dxa"/>
             <w:tcMar>
               <w:top w:w="100" w:type="dxa"/>
               <w:left w:w="100" w:type="dxa"/>
@@ -552,7 +608,7 @@
         </w:trPr>
         <w:tc>
           <w:tcPr>
-            <w:tcW w:w="9354" w:type="dxa"/>
+            <w:tcW w:w="13797" w:type="dxa"/>
             <w:gridSpan w:val="3"/>
             <w:tcMar>
               <w:top w:w="100" w:type="dxa"/>
@@ -591,7 +647,7 @@
       <w:tr>
         <w:tc>
           <w:tcPr>
-            <w:tcW w:w="3118" w:type="dxa"/>
+            <w:tcW w:w="4350" w:type="dxa"/>
             <w:tcMar>
               <w:top w:w="100" w:type="dxa"/>
               <w:left w:w="100" w:type="dxa"/>
@@ -627,7 +683,7 @@
         </w:tc>
         <w:tc>
           <w:tcPr>
-            <w:tcW w:w="3118" w:type="dxa"/>
+            <w:tcW w:w="5879" w:type="dxa"/>
             <w:tcMar>
               <w:top w:w="100" w:type="dxa"/>
               <w:left w:w="100" w:type="dxa"/>
@@ -663,7 +719,7 @@
         </w:tc>
         <w:tc>
           <w:tcPr>
-            <w:tcW w:w="3118" w:type="dxa"/>
+            <w:tcW w:w="3568" w:type="dxa"/>
             <w:tcMar>
               <w:top w:w="100" w:type="dxa"/>
               <w:left w:w="100" w:type="dxa"/>
@@ -704,7 +760,7 @@
         </w:trPr>
         <w:tc>
           <w:tcPr>
-            <w:tcW w:w="9354" w:type="dxa"/>
+            <w:tcW w:w="13797" w:type="dxa"/>
             <w:gridSpan w:val="3"/>
             <w:tcMar>
               <w:top w:w="100" w:type="dxa"/>
@@ -752,8 +808,7 @@
     </w:p>
     <w:tbl>
       <w:tblPr>
-        <w:tblStyle w:val="a1"/>
-        <w:tblW w:w="9355" w:type="dxa"/>
+        <w:tblW w:w="14032" w:type="dxa"/>
         <w:tblInd w:w="0" w:type="dxa"/>
         <w:tblBorders>
           <w:top w:val="nil"/>
@@ -768,12 +823,34 @@
       </w:tblPr>
       <w:tblGrid>
         <w:gridCol w:w="4677"/>
+        <w:gridCol w:w="4677"/>
         <w:gridCol w:w="4678"/>
       </w:tblGrid>
       <w:tr>
+        <w:trPr>
+          <w:trHeight w:val="300"/>
+        </w:trPr>
         <w:tc>
           <w:tcPr>
             <w:tcW w:w="4677" w:type="dxa"/>
+            <w:tcMar/>
+          </w:tcPr>
+          <w:p>
+            <w:pPr>
+              <w:pStyle w:val="Normal"/>
+              <w:rPr>
+                <w:b w:val="0"/>
+                <w:bCs w:val="0"/>
+                <w:sz w:val="26"/>
+                <w:szCs w:val="26"/>
+              </w:rPr>
+            </w:pPr>
+          </w:p>
+        </w:tc>
+        <w:tc>
+          <w:tcPr>
+            <w:tcW w:w="4677" w:type="dxa"/>
+            <w:tcMar/>
           </w:tcPr>
           <w:p>
             <w:pPr>
@@ -788,6 +865,7 @@
         <w:tc>
           <w:tcPr>
             <w:tcW w:w="4678" w:type="dxa"/>
+            <w:tcMar/>
           </w:tcPr>
           <w:p>
             <w:pPr>
@@ -795,12 +873,14 @@
               <w:rPr>
                 <w:sz w:val="26"/>
                 <w:szCs w:val="26"/>
+                <w:lang w:val="en-US"/>
               </w:rPr>
             </w:pPr>
             <w:r>
               <w:rPr>
                 <w:sz w:val="26"/>
                 <w:szCs w:val="26"/>
+                <w:lang w:val="en-US"/>
               </w:rPr>
               <w:t>{commanderPosition}</w:t>
             </w:r>
@@ -864,12 +944,14 @@
               <w:rPr>
                 <w:sz w:val="26"/>
                 <w:szCs w:val="26"/>
+                <w:lang w:val="en-US"/>
               </w:rPr>
             </w:pPr>
             <w:r>
               <w:rPr>
                 <w:sz w:val="26"/>
                 <w:szCs w:val="26"/>
+                <w:lang w:val="en-US"/>
               </w:rPr>
               <w:t>{commanderRank} {commanderName}</w:t>
             </w:r>
@@ -887,7 +969,7 @@
       </w:pPr>
     </w:p>
     <w:sectPr>
-      <w:pgSz w:w="11907" w:h="16840"/>
+      <w:pgSz w:w="16840" w:h="11907" w:orient="landscape"/>
       <w:pgMar w:top="1134" w:right="851" w:bottom="1134" w:left="1701" w:header="567" w:footer="272" w:gutter="0"/>
       <w:pgNumType w:start="1"/>
       <w:cols w:space="720"/>
@@ -902,7 +984,7 @@
   <w:docDefaults>
     <w:rPrDefault>
       <w:rPr>
-        <w:rFonts w:ascii="Times New Roman" w:eastAsia="Times New Roman" w:hAnsi="Times New Roman" w:cs="Times New Roman"/>
+        <w:rFonts w:ascii="Times New Roman" w:hAnsi="Times New Roman" w:eastAsia="Times New Roman" w:cs="Times New Roman"/>
         <w:b/>
         <w:sz w:val="28"/>
         <w:szCs w:val="28"/>
@@ -914,14 +996,14 @@
   <w:latentStyles w:defLockedState="0" w:defUIPriority="99" w:defSemiHidden="0" w:defUnhideWhenUsed="0" w:defQFormat="0" w:count="376">
     <w:lsdException w:name="Normal" w:uiPriority="0" w:qFormat="1"/>
     <w:lsdException w:name="heading 1" w:uiPriority="9" w:qFormat="1"/>
-    <w:lsdException w:name="heading 2" w:semiHidden="1" w:uiPriority="9" w:unhideWhenUsed="1" w:qFormat="1"/>
-    <w:lsdException w:name="heading 3" w:semiHidden="1" w:uiPriority="9" w:unhideWhenUsed="1" w:qFormat="1"/>
-    <w:lsdException w:name="heading 4" w:semiHidden="1" w:uiPriority="9" w:unhideWhenUsed="1" w:qFormat="1"/>
-    <w:lsdException w:name="heading 5" w:semiHidden="1" w:uiPriority="9" w:unhideWhenUsed="1" w:qFormat="1"/>
-    <w:lsdException w:name="heading 6" w:semiHidden="1" w:uiPriority="9" w:unhideWhenUsed="1" w:qFormat="1"/>
-    <w:lsdException w:name="heading 7" w:semiHidden="1" w:uiPriority="9" w:unhideWhenUsed="1" w:qFormat="1"/>
-    <w:lsdException w:name="heading 8" w:semiHidden="1" w:uiPriority="9" w:unhideWhenUsed="1" w:qFormat="1"/>
-    <w:lsdException w:name="heading 9" w:semiHidden="1" w:uiPriority="9" w:unhideWhenUsed="1" w:qFormat="1"/>
+    <w:lsdException w:name="heading 2" w:uiPriority="9" w:semiHidden="1" w:unhideWhenUsed="1" w:qFormat="1"/>
+    <w:lsdException w:name="heading 3" w:uiPriority="9" w:semiHidden="1" w:unhideWhenUsed="1" w:qFormat="1"/>
+    <w:lsdException w:name="heading 4" w:uiPriority="9" w:semiHidden="1" w:unhideWhenUsed="1" w:qFormat="1"/>
+    <w:lsdException w:name="heading 5" w:uiPriority="9" w:semiHidden="1" w:unhideWhenUsed="1" w:qFormat="1"/>
+    <w:lsdException w:name="heading 6" w:uiPriority="9" w:semiHidden="1" w:unhideWhenUsed="1" w:qFormat="1"/>
+    <w:lsdException w:name="heading 7" w:uiPriority="9" w:semiHidden="1" w:unhideWhenUsed="1" w:qFormat="1"/>
+    <w:lsdException w:name="heading 8" w:uiPriority="9" w:semiHidden="1" w:unhideWhenUsed="1" w:qFormat="1"/>
+    <w:lsdException w:name="heading 9" w:uiPriority="9" w:semiHidden="1" w:unhideWhenUsed="1" w:qFormat="1"/>
     <w:lsdException w:name="index 1" w:semiHidden="1" w:unhideWhenUsed="1"/>
     <w:lsdException w:name="index 2" w:semiHidden="1" w:unhideWhenUsed="1"/>
     <w:lsdException w:name="index 3" w:semiHidden="1" w:unhideWhenUsed="1"/>
@@ -931,22 +1013,22 @@
     <w:lsdException w:name="index 7" w:semiHidden="1" w:unhideWhenUsed="1"/>
     <w:lsdException w:name="index 8" w:semiHidden="1" w:unhideWhenUsed="1"/>
     <w:lsdException w:name="index 9" w:semiHidden="1" w:unhideWhenUsed="1"/>
-    <w:lsdException w:name="toc 1" w:semiHidden="1" w:uiPriority="39" w:unhideWhenUsed="1"/>
-    <w:lsdException w:name="toc 2" w:semiHidden="1" w:uiPriority="39" w:unhideWhenUsed="1"/>
-    <w:lsdException w:name="toc 3" w:semiHidden="1" w:uiPriority="39" w:unhideWhenUsed="1"/>
-    <w:lsdException w:name="toc 4" w:semiHidden="1" w:uiPriority="39" w:unhideWhenUsed="1"/>
-    <w:lsdException w:name="toc 5" w:semiHidden="1" w:uiPriority="39" w:unhideWhenUsed="1"/>
-    <w:lsdException w:name="toc 6" w:semiHidden="1" w:uiPriority="39" w:unhideWhenUsed="1"/>
-    <w:lsdException w:name="toc 7" w:semiHidden="1" w:uiPriority="39" w:unhideWhenUsed="1"/>
-    <w:lsdException w:name="toc 8" w:semiHidden="1" w:uiPriority="39" w:unhideWhenUsed="1"/>
-    <w:lsdException w:name="toc 9" w:semiHidden="1" w:uiPriority="39" w:unhideWhenUsed="1"/>
+    <w:lsdException w:name="toc 1" w:uiPriority="39" w:semiHidden="1" w:unhideWhenUsed="1"/>
+    <w:lsdException w:name="toc 2" w:uiPriority="39" w:semiHidden="1" w:unhideWhenUsed="1"/>
+    <w:lsdException w:name="toc 3" w:uiPriority="39" w:semiHidden="1" w:unhideWhenUsed="1"/>
+    <w:lsdException w:name="toc 4" w:uiPriority="39" w:semiHidden="1" w:unhideWhenUsed="1"/>
+    <w:lsdException w:name="toc 5" w:uiPriority="39" w:semiHidden="1" w:unhideWhenUsed="1"/>
+    <w:lsdException w:name="toc 6" w:uiPriority="39" w:semiHidden="1" w:unhideWhenUsed="1"/>
+    <w:lsdException w:name="toc 7" w:uiPriority="39" w:semiHidden="1" w:unhideWhenUsed="1"/>
+    <w:lsdException w:name="toc 8" w:uiPriority="39" w:semiHidden="1" w:unhideWhenUsed="1"/>
+    <w:lsdException w:name="toc 9" w:uiPriority="39" w:semiHidden="1" w:unhideWhenUsed="1"/>
     <w:lsdException w:name="Normal Indent" w:semiHidden="1" w:unhideWhenUsed="1"/>
     <w:lsdException w:name="footnote text" w:semiHidden="1" w:unhideWhenUsed="1"/>
     <w:lsdException w:name="annotation text" w:semiHidden="1" w:unhideWhenUsed="1"/>
     <w:lsdException w:name="header" w:semiHidden="1" w:unhideWhenUsed="1"/>
     <w:lsdException w:name="footer" w:semiHidden="1" w:unhideWhenUsed="1"/>
     <w:lsdException w:name="index heading" w:semiHidden="1" w:unhideWhenUsed="1"/>
-    <w:lsdException w:name="caption" w:semiHidden="1" w:uiPriority="35" w:unhideWhenUsed="1" w:qFormat="1"/>
+    <w:lsdException w:name="caption" w:uiPriority="35" w:semiHidden="1" w:unhideWhenUsed="1" w:qFormat="1"/>
     <w:lsdException w:name="table of figures" w:semiHidden="1" w:unhideWhenUsed="1"/>
     <w:lsdException w:name="envelope address" w:semiHidden="1" w:unhideWhenUsed="1"/>
     <w:lsdException w:name="envelope return" w:semiHidden="1" w:unhideWhenUsed="1"/>
@@ -977,7 +1059,7 @@
     <w:lsdException w:name="Title" w:uiPriority="10" w:qFormat="1"/>
     <w:lsdException w:name="Closing" w:semiHidden="1" w:unhideWhenUsed="1"/>
     <w:lsdException w:name="Signature" w:semiHidden="1" w:unhideWhenUsed="1"/>
-    <w:lsdException w:name="Default Paragraph Font" w:semiHidden="1" w:uiPriority="1" w:unhideWhenUsed="1"/>
+    <w:lsdException w:name="Default Paragraph Font" w:uiPriority="1" w:semiHidden="1" w:unhideWhenUsed="1"/>
     <w:lsdException w:name="Body Text" w:semiHidden="1" w:unhideWhenUsed="1"/>
     <w:lsdException w:name="Body Text Indent" w:semiHidden="1" w:unhideWhenUsed="1"/>
     <w:lsdException w:name="List Continue" w:semiHidden="1" w:unhideWhenUsed="1"/>
@@ -1177,8 +1259,8 @@
     <w:lsdException w:name="Subtle Reference" w:uiPriority="31" w:qFormat="1"/>
     <w:lsdException w:name="Intense Reference" w:uiPriority="32" w:qFormat="1"/>
     <w:lsdException w:name="Book Title" w:uiPriority="33" w:qFormat="1"/>
-    <w:lsdException w:name="Bibliography" w:semiHidden="1" w:uiPriority="37" w:unhideWhenUsed="1"/>
-    <w:lsdException w:name="TOC Heading" w:semiHidden="1" w:uiPriority="39" w:unhideWhenUsed="1" w:qFormat="1"/>
+    <w:lsdException w:name="Bibliography" w:uiPriority="37" w:semiHidden="1" w:unhideWhenUsed="1"/>
+    <w:lsdException w:name="TOC Heading" w:uiPriority="39" w:semiHidden="1" w:unhideWhenUsed="1" w:qFormat="1"/>
     <w:lsdException w:name="Plain Table 1" w:uiPriority="41"/>
     <w:lsdException w:name="Plain Table 2" w:uiPriority="42"/>
     <w:lsdException w:name="Plain Table 3" w:uiPriority="43"/>
@@ -1289,7 +1371,7 @@
     <w:lsdException w:name="Unresolved Mention" w:semiHidden="1" w:unhideWhenUsed="1"/>
     <w:lsdException w:name="Smart Link" w:semiHidden="1" w:unhideWhenUsed="1"/>
   </w:latentStyles>
-  <w:style w:type="paragraph" w:default="1" w:styleId="Normal">
+  <w:style w:type="paragraph" w:styleId="Normal" w:default="1">
     <w:name w:val="Normal"/>
     <w:qFormat/>
   </w:style>
@@ -1401,13 +1483,13 @@
       <w:szCs w:val="20"/>
     </w:rPr>
   </w:style>
-  <w:style w:type="character" w:default="1" w:styleId="DefaultParagraphFont">
+  <w:style w:type="character" w:styleId="DefaultParagraphFont" w:default="1">
     <w:name w:val="Default Paragraph Font"/>
     <w:uiPriority w:val="1"/>
     <w:semiHidden/>
     <w:unhideWhenUsed/>
   </w:style>
-  <w:style w:type="table" w:default="1" w:styleId="TableNormal">
+  <w:style w:type="table" w:styleId="TableNormal" w:default="1">
     <w:name w:val="Normal Table"/>
     <w:uiPriority w:val="99"/>
     <w:semiHidden/>
@@ -1422,13 +1504,13 @@
       </w:tblCellMar>
     </w:tblPr>
   </w:style>
-  <w:style w:type="numbering" w:default="1" w:styleId="NoList">
+  <w:style w:type="numbering" w:styleId="NoList" w:default="1">
     <w:name w:val="No List"/>
     <w:uiPriority w:val="99"/>
     <w:semiHidden/>
     <w:unhideWhenUsed/>
   </w:style>
-  <w:style w:type="table" w:customStyle="1" w:styleId="TableNormal0">
+  <w:style w:type="table" w:styleId="TableNormal0" w:customStyle="1">
     <w:name w:val="TableNormal"/>
     <w:tblPr>
       <w:tblCellMar>
@@ -1467,14 +1549,14 @@
       <w:spacing w:before="360" w:after="80"/>
     </w:pPr>
     <w:rPr>
-      <w:rFonts w:ascii="Georgia" w:eastAsia="Georgia" w:hAnsi="Georgia" w:cs="Georgia"/>
+      <w:rFonts w:ascii="Georgia" w:hAnsi="Georgia" w:eastAsia="Georgia" w:cs="Georgia"/>
       <w:i/>
       <w:color w:val="666666"/>
       <w:sz w:val="48"/>
       <w:szCs w:val="48"/>
     </w:rPr>
   </w:style>
-  <w:style w:type="table" w:customStyle="1" w:styleId="a">
+  <w:style w:type="table" w:styleId="a" w:customStyle="1">
     <w:basedOn w:val="TableNormal0"/>
     <w:tblPr>
       <w:tblStyleRowBandSize w:val="1"/>
@@ -1487,7 +1569,7 @@
       </w:tblCellMar>
     </w:tblPr>
   </w:style>
-  <w:style w:type="table" w:customStyle="1" w:styleId="a0">
+  <w:style w:type="table" w:styleId="a0" w:customStyle="1">
     <w:basedOn w:val="TableNormal0"/>
     <w:tblPr>
       <w:tblStyleRowBandSize w:val="1"/>
@@ -1500,7 +1582,7 @@
       </w:tblCellMar>
     </w:tblPr>
   </w:style>
-  <w:style w:type="table" w:customStyle="1" w:styleId="a1">
+  <w:style w:type="table" w:styleId="a1" w:customStyle="1">
     <w:basedOn w:val="TableNormal0"/>
     <w:tblPr>
       <w:tblStyleRowBandSize w:val="1"/>

</xml_diff>

<commit_message>
chore(api): fix docx templ
</commit_message>
<xml_diff>
--- a/apps/api/templates/dynamic-docx-template.docx
+++ b/apps/api/templates/dynamic-docx-template.docx
@@ -1,6 +1,6 @@
 
 <file path=word/document.xml><?xml version="1.0" encoding="utf-8"?>
-<w:document xmlns:wpc="http://schemas.microsoft.com/office/word/2010/wordprocessingCanvas" xmlns:cx="http://schemas.microsoft.com/office/drawing/2014/chartex" xmlns:cx1="http://schemas.microsoft.com/office/drawing/2015/9/8/chartex" xmlns:cx2="http://schemas.microsoft.com/office/drawing/2015/10/21/chartex" xmlns:cx3="http://schemas.microsoft.com/office/drawing/2016/5/9/chartex" xmlns:cx4="http://schemas.microsoft.com/office/drawing/2016/5/10/chartex" xmlns:cx5="http://schemas.microsoft.com/office/drawing/2016/5/11/chartex" xmlns:cx6="http://schemas.microsoft.com/office/drawing/2016/5/12/chartex" xmlns:cx7="http://schemas.microsoft.com/office/drawing/2016/5/13/chartex" xmlns:cx8="http://schemas.microsoft.com/office/drawing/2016/5/14/chartex" xmlns:mc="http://schemas.openxmlformats.org/markup-compatibility/2006" xmlns:aink="http://schemas.microsoft.com/office/drawing/2016/ink" xmlns:am3d="http://schemas.microsoft.com/office/drawing/2017/model3d" xmlns:o="urn:schemas-microsoft-com:office:office" xmlns:oel="http://schemas.microsoft.com/office/2019/extlst" xmlns:r="http://schemas.openxmlformats.org/officeDocument/2006/relationships" xmlns:m="http://schemas.openxmlformats.org/officeDocument/2006/math" xmlns:v="urn:schemas-microsoft-com:vml" xmlns:wp14="http://schemas.microsoft.com/office/word/2010/wordprocessingDrawing" xmlns:wp="http://schemas.openxmlformats.org/drawingml/2006/wordprocessingDrawing" xmlns:w10="urn:schemas-microsoft-com:office:word" xmlns:w="http://schemas.openxmlformats.org/wordprocessingml/2006/main" xmlns:w14="http://schemas.microsoft.com/office/word/2010/wordml" xmlns:w15="http://schemas.microsoft.com/office/word/2012/wordml" xmlns:w16cex="http://schemas.microsoft.com/office/word/2018/wordml/cex" xmlns:w16cid="http://schemas.microsoft.com/office/word/2016/wordml/cid" xmlns:w16="http://schemas.microsoft.com/office/word/2018/wordml" xmlns:w16du="http://schemas.microsoft.com/office/word/2023/wordml/word16du" xmlns:w16sdtdh="http://schemas.microsoft.com/office/word/2020/wordml/sdtdatahash" xmlns:w16sdtfl="http://schemas.microsoft.com/office/word/2024/wordml/sdtformatlock" xmlns:w16se="http://schemas.microsoft.com/office/word/2015/wordml/symex" xmlns:wpg="http://schemas.microsoft.com/office/word/2010/wordprocessingGroup" xmlns:wpi="http://schemas.microsoft.com/office/word/2010/wordprocessingInk" xmlns:wne="http://schemas.microsoft.com/office/word/2006/wordml" xmlns:wps="http://schemas.microsoft.com/office/word/2010/wordprocessingShape" xmlns:a="http://schemas.openxmlformats.org/drawingml/2006/main" xmlns:pic="http://schemas.openxmlformats.org/drawingml/2006/picture" mc:Ignorable="w14 w15 w16se w16cid w16 w16cex w16sdtdh w16sdtfl w16du wp14">
+<w:document xmlns:wpc="http://schemas.microsoft.com/office/word/2010/wordprocessingCanvas" xmlns:cx="http://schemas.microsoft.com/office/drawing/2014/chartex" xmlns:cx1="http://schemas.microsoft.com/office/drawing/2015/9/8/chartex" xmlns:cx2="http://schemas.microsoft.com/office/drawing/2015/10/21/chartex" xmlns:cx3="http://schemas.microsoft.com/office/drawing/2016/5/9/chartex" xmlns:cx4="http://schemas.microsoft.com/office/drawing/2016/5/10/chartex" xmlns:cx5="http://schemas.microsoft.com/office/drawing/2016/5/11/chartex" xmlns:cx6="http://schemas.microsoft.com/office/drawing/2016/5/12/chartex" xmlns:cx7="http://schemas.microsoft.com/office/drawing/2016/5/13/chartex" xmlns:cx8="http://schemas.microsoft.com/office/drawing/2016/5/14/chartex" xmlns:mc="http://schemas.openxmlformats.org/markup-compatibility/2006" xmlns:aink="http://schemas.microsoft.com/office/drawing/2016/ink" xmlns:am3d="http://schemas.microsoft.com/office/drawing/2017/model3d" xmlns:o="urn:schemas-microsoft-com:office:office" xmlns:r="http://schemas.openxmlformats.org/officeDocument/2006/relationships" xmlns:m="http://schemas.openxmlformats.org/officeDocument/2006/math" xmlns:v="urn:schemas-microsoft-com:vml" xmlns:wp14="http://schemas.microsoft.com/office/word/2010/wordprocessingDrawing" xmlns:wp="http://schemas.openxmlformats.org/drawingml/2006/wordprocessingDrawing" xmlns:w10="urn:schemas-microsoft-com:office:word" xmlns:w="http://schemas.openxmlformats.org/wordprocessingml/2006/main" xmlns:w14="http://schemas.microsoft.com/office/word/2010/wordml" xmlns:w15="http://schemas.microsoft.com/office/word/2012/wordml" xmlns:w16cid="http://schemas.microsoft.com/office/word/2016/wordml/cid" xmlns:w16se="http://schemas.microsoft.com/office/word/2015/wordml/symex" xmlns:wpg="http://schemas.microsoft.com/office/word/2010/wordprocessingGroup" xmlns:wpi="http://schemas.microsoft.com/office/word/2010/wordprocessingInk" xmlns:wne="http://schemas.microsoft.com/office/word/2006/wordml" xmlns:wps="http://schemas.microsoft.com/office/word/2010/wordprocessingShape" mc:Ignorable="w14 w15 w16se w16cid wp14">
   <w:body>
     <w:p>
       <w:pPr>
@@ -14,7 +14,7 @@
         </w:pBdr>
         <w:spacing w:line="276" w:lineRule="auto"/>
         <w:rPr>
-          <w:rFonts w:ascii="Arial" w:hAnsi="Arial" w:eastAsia="Arial" w:cs="Arial"/>
+          <w:rFonts w:ascii="Arial" w:eastAsia="Arial" w:hAnsi="Arial" w:cs="Arial"/>
           <w:b w:val="0"/>
           <w:color w:val="000000"/>
           <w:sz w:val="22"/>
@@ -46,14 +46,12 @@
         <w:tc>
           <w:tcPr>
             <w:tcW w:w="3922" w:type="dxa"/>
-            <w:tcMar/>
           </w:tcPr>
           <w:p>
             <w:pPr>
               <w:jc w:val="center"/>
               <w:rPr>
                 <w:b w:val="0"/>
-                <w:bCs w:val="0"/>
                 <w:sz w:val="26"/>
                 <w:szCs w:val="26"/>
                 <w:lang w:val="en-US"/>
@@ -62,7 +60,6 @@
             <w:r>
               <w:rPr>
                 <w:b w:val="0"/>
-                <w:bCs w:val="0"/>
                 <w:sz w:val="26"/>
                 <w:szCs w:val="26"/>
                 <w:lang w:val="en-US"/>
@@ -84,7 +81,6 @@
               <w:jc w:val="center"/>
               <w:rPr>
                 <w:b w:val="0"/>
-                <w:bCs w:val="0"/>
                 <w:sz w:val="26"/>
                 <w:szCs w:val="26"/>
                 <w:lang w:val="en-US"/>
@@ -97,90 +93,18 @@
                 <w:lang w:val="en-US"/>
               </w:rPr>
               <w:t>{underUnitName}</w:t>
-            </w:r>
-            <w:r>
-              <w:rPr>
-                <w:noProof/>
-              </w:rPr>
-              <mc:AlternateContent>
-                <mc:Choice Requires="wps">
-                  <w:drawing>
-                    <wp:anchor distT="0" distB="0" distL="114300" distR="114300" simplePos="0" relativeHeight="251658240" behindDoc="0" locked="0" layoutInCell="1" hidden="0" allowOverlap="1" wp14:anchorId="59F2BB69" wp14:editId="1263C106">
-                      <wp:simplePos x="0" y="0"/>
-                      <wp:positionH relativeFrom="column">
-                        <wp:posOffset>336550</wp:posOffset>
-                      </wp:positionH>
-                      <wp:positionV relativeFrom="paragraph">
-                        <wp:posOffset>221615</wp:posOffset>
-                      </wp:positionV>
-                      <wp:extent cx="571500" cy="0"/>
-                      <wp:effectExtent l="0" t="0" r="0" b="0"/>
-                      <wp:wrapNone/>
-                      <wp:docPr id="2" name="Straight Arrow Connector 2"/>
-                      <wp:cNvGraphicFramePr/>
-                      <a:graphic xmlns:a="http://schemas.openxmlformats.org/drawingml/2006/main">
-                        <a:graphicData uri="http://schemas.microsoft.com/office/word/2010/wordprocessingShape">
-                          <wps:wsp>
-                            <wps:cNvCnPr/>
-                            <wps:spPr>
-                              <a:xfrm>
-                                <a:off x="0" y="0"/>
-                                <a:ext cx="571500" cy="0"/>
-                              </a:xfrm>
-                              <a:prstGeom prst="straightConnector1">
-                                <a:avLst/>
-                              </a:prstGeom>
-                              <a:noFill/>
-                              <a:ln w="9525" cap="flat" cmpd="sng">
-                                <a:solidFill>
-                                  <a:schemeClr val="dk1"/>
-                                </a:solidFill>
-                                <a:prstDash val="solid"/>
-                                <a:miter lim="800000"/>
-                                <a:headEnd type="none" w="sm" len="sm"/>
-                                <a:tailEnd type="none" w="sm" len="sm"/>
-                              </a:ln>
-                            </wps:spPr>
-                            <wps:bodyPr/>
-                          </wps:wsp>
-                        </a:graphicData>
-                      </a:graphic>
-                      <wp14:sizeRelH relativeFrom="margin">
-                        <wp14:pctWidth>0</wp14:pctWidth>
-                      </wp14:sizeRelH>
-                      <wp14:sizeRelV relativeFrom="margin">
-                        <wp14:pctHeight>0</wp14:pctHeight>
-                      </wp14:sizeRelV>
-                    </wp:anchor>
-                  </w:drawing>
-                </mc:Choice>
-                <mc:Fallback>
-                  <w:pict>
-                    <v:shapetype id="_x0000_t32" coordsize="21600,21600" o:oned="t" filled="f" o:spt="32" path="m,l21600,21600e" w14:anchorId="76D7E314">
-                      <v:path fillok="f" arrowok="t" o:connecttype="none"/>
-                      <o:lock v:ext="edit" shapetype="t"/>
-                    </v:shapetype>
-                    <v:shape id="Straight Arrow Connector 2" style="position:absolute;margin-left:26.5pt;margin-top:17.45pt;width:45pt;height:0;z-index:251658240;visibility:visible;mso-wrap-style:square;mso-width-percent:0;mso-height-percent:0;mso-wrap-distance-left:9pt;mso-wrap-distance-top:0;mso-wrap-distance-right:9pt;mso-wrap-distance-bottom:0;mso-position-horizontal:absolute;mso-position-horizontal-relative:text;mso-position-vertical:absolute;mso-position-vertical-relative:text;mso-width-percent:0;mso-height-percent:0;mso-width-relative:margin;mso-height-relative:margin" o:spid="_x0000_s1026" strokecolor="black [3200]" type="#_x0000_t32" o:gfxdata="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">
-                      <v:stroke joinstyle="miter" startarrowwidth="narrow" startarrowlength="short" endarrowwidth="narrow" endarrowlength="short"/>
-                    </v:shape>
-                  </w:pict>
-                </mc:Fallback>
-              </mc:AlternateContent>
             </w:r>
           </w:p>
         </w:tc>
         <w:tc>
           <w:tcPr>
             <w:tcW w:w="3922" w:type="dxa"/>
-            <w:tcMar/>
           </w:tcPr>
           <w:p>
             <w:pPr>
-              <w:pStyle w:val="Normal"/>
               <w:jc w:val="center"/>
               <w:rPr>
                 <w:b w:val="0"/>
-                <w:bCs w:val="0"/>
                 <w:sz w:val="26"/>
                 <w:szCs w:val="26"/>
                 <w:lang w:val="en-US"/>
@@ -191,7 +115,6 @@
         <w:tc>
           <w:tcPr>
             <w:tcW w:w="6720" w:type="dxa"/>
-            <w:tcMar/>
           </w:tcPr>
           <w:p>
             <w:pPr>
@@ -280,7 +203,7 @@
                     </wp:anchor>
                   </w:drawing>
                 </mc:Choice>
-                <mc:Fallback>
+                <mc:Fallback xmlns:pic="http://schemas.openxmlformats.org/drawingml/2006/picture" xmlns:a="http://schemas.openxmlformats.org/drawingml/2006/main" xmlns:w16sdtfl="http://schemas.microsoft.com/office/word/2024/wordml/sdtformatlock" xmlns:w16sdtdh="http://schemas.microsoft.com/office/word/2020/wordml/sdtdatahash" xmlns:w16du="http://schemas.microsoft.com/office/word/2023/wordml/word16du" xmlns:w16="http://schemas.microsoft.com/office/word/2018/wordml" xmlns:w16cex="http://schemas.microsoft.com/office/word/2018/wordml/cex" xmlns:oel="http://schemas.microsoft.com/office/2019/extlst">
                   <w:pict>
                     <v:shape id="Straight Arrow Connector 1" style="position:absolute;margin-left:93.4pt;margin-top:17.35pt;width:170.9pt;height:0;z-index:251659264;visibility:visible;mso-wrap-style:square;mso-height-percent:0;mso-wrap-distance-left:9pt;mso-wrap-distance-top:0;mso-wrap-distance-right:9pt;mso-wrap-distance-bottom:0;mso-position-horizontal:absolute;mso-position-horizontal-relative:text;mso-position-vertical:absolute;mso-position-vertical-relative:text;mso-height-percent:0;mso-height-relative:margin" o:spid="_x0000_s1026" strokecolor="black [3200]" type="#_x0000_t32" o:gfxdata="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" w14:anchorId="717B003D">
                       <v:stroke joinstyle="miter" startarrowwidth="narrow" startarrowlength="short" endarrowwidth="narrow" endarrowlength="short"/>
@@ -296,7 +219,6 @@
         <w:tc>
           <w:tcPr>
             <w:tcW w:w="3922" w:type="dxa"/>
-            <w:tcMar/>
           </w:tcPr>
           <w:p>
             <w:pPr>
@@ -305,16 +227,83 @@
                 <w:szCs w:val="26"/>
               </w:rPr>
             </w:pPr>
+            <w:r>
+              <w:rPr>
+                <w:noProof/>
+              </w:rPr>
+              <mc:AlternateContent>
+                <mc:Choice Requires="wps">
+                  <w:drawing>
+                    <wp:anchor distT="0" distB="0" distL="114300" distR="114300" simplePos="0" relativeHeight="251658240" behindDoc="0" locked="0" layoutInCell="1" hidden="0" allowOverlap="1" wp14:anchorId="59F2BB69" wp14:editId="31EF1715">
+                      <wp:simplePos x="0" y="0"/>
+                      <wp:positionH relativeFrom="column">
+                        <wp:posOffset>898525</wp:posOffset>
+                      </wp:positionH>
+                      <wp:positionV relativeFrom="paragraph">
+                        <wp:posOffset>6985</wp:posOffset>
+                      </wp:positionV>
+                      <wp:extent cx="571500" cy="0"/>
+                      <wp:effectExtent l="0" t="0" r="0" b="0"/>
+                      <wp:wrapNone/>
+                      <wp:docPr id="2" name="Straight Arrow Connector 2"/>
+                      <wp:cNvGraphicFramePr/>
+                      <a:graphic xmlns:a="http://schemas.openxmlformats.org/drawingml/2006/main">
+                        <a:graphicData uri="http://schemas.microsoft.com/office/word/2010/wordprocessingShape">
+                          <wps:wsp>
+                            <wps:cNvCnPr/>
+                            <wps:spPr>
+                              <a:xfrm>
+                                <a:off x="0" y="0"/>
+                                <a:ext cx="571500" cy="0"/>
+                              </a:xfrm>
+                              <a:prstGeom prst="straightConnector1">
+                                <a:avLst/>
+                              </a:prstGeom>
+                              <a:noFill/>
+                              <a:ln w="9525" cap="flat" cmpd="sng">
+                                <a:solidFill>
+                                  <a:schemeClr val="dk1"/>
+                                </a:solidFill>
+                                <a:prstDash val="solid"/>
+                                <a:miter lim="800000"/>
+                                <a:headEnd type="none" w="sm" len="sm"/>
+                                <a:tailEnd type="none" w="sm" len="sm"/>
+                              </a:ln>
+                            </wps:spPr>
+                            <wps:bodyPr/>
+                          </wps:wsp>
+                        </a:graphicData>
+                      </a:graphic>
+                      <wp14:sizeRelH relativeFrom="margin">
+                        <wp14:pctWidth>0</wp14:pctWidth>
+                      </wp14:sizeRelH>
+                      <wp14:sizeRelV relativeFrom="margin">
+                        <wp14:pctHeight>0</wp14:pctHeight>
+                      </wp14:sizeRelV>
+                    </wp:anchor>
+                  </w:drawing>
+                </mc:Choice>
+                <mc:Fallback>
+                  <w:pict>
+                    <v:shapetype w14:anchorId="1B3666A7" id="_x0000_t32" coordsize="21600,21600" o:spt="32" o:oned="t" path="m,l21600,21600e" filled="f">
+                      <v:path arrowok="t" fillok="f" o:connecttype="none"/>
+                      <o:lock v:ext="edit" shapetype="t"/>
+                    </v:shapetype>
+                    <v:shape id="Straight Arrow Connector 2" o:spid="_x0000_s1026" type="#_x0000_t32" style="position:absolute;margin-left:70.75pt;margin-top:.55pt;width:45pt;height:0;z-index:251658240;visibility:visible;mso-wrap-style:square;mso-width-percent:0;mso-height-percent:0;mso-wrap-distance-left:9pt;mso-wrap-distance-top:0;mso-wrap-distance-right:9pt;mso-wrap-distance-bottom:0;mso-position-horizontal:absolute;mso-position-horizontal-relative:text;mso-position-vertical:absolute;mso-position-vertical-relative:text;mso-width-percent:0;mso-height-percent:0;mso-width-relative:margin;mso-height-relative:margin" o:gfxdata="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" strokecolor="black [3200]">
+                      <v:stroke startarrowwidth="narrow" startarrowlength="short" endarrowwidth="narrow" endarrowlength="short" joinstyle="miter"/>
+                    </v:shape>
+                  </w:pict>
+                </mc:Fallback>
+              </mc:AlternateContent>
+            </w:r>
           </w:p>
         </w:tc>
         <w:tc>
           <w:tcPr>
             <w:tcW w:w="3922" w:type="dxa"/>
-            <w:tcMar/>
           </w:tcPr>
           <w:p>
             <w:pPr>
-              <w:pStyle w:val="Normal"/>
               <w:rPr>
                 <w:sz w:val="26"/>
                 <w:szCs w:val="26"/>
@@ -325,7 +314,6 @@
         <w:tc>
           <w:tcPr>
             <w:tcW w:w="6720" w:type="dxa"/>
-            <w:tcMar/>
           </w:tcPr>
           <w:p>
             <w:pPr>
@@ -333,9 +321,8 @@
               <w:jc w:val="center"/>
               <w:rPr>
                 <w:b w:val="0"/>
-                <w:bCs w:val="0"/>
-                <w:i w:val="1"/>
-                <w:iCs w:val="1"/>
+                <w:i/>
+                <w:iCs/>
                 <w:sz w:val="26"/>
                 <w:szCs w:val="26"/>
                 <w:lang w:val="en-US"/>
@@ -344,9 +331,8 @@
             <w:r>
               <w:rPr>
                 <w:b w:val="0"/>
-                <w:bCs w:val="0"/>
-                <w:i w:val="1"/>
-                <w:iCs w:val="1"/>
+                <w:i/>
+                <w:iCs/>
                 <w:sz w:val="26"/>
                 <w:szCs w:val="26"/>
                 <w:lang w:val="en-US"/>
@@ -364,26 +350,20 @@
       </w:pPr>
       <w:r>
         <w:rPr>
-          <w:lang w:val="en-US"/>
-        </w:rPr>
-        <w:t>{reportTitle}</w:t>
-      </w:r>
-      <w:r>
-        <w:rPr>
           <w:noProof/>
         </w:rPr>
         <mc:AlternateContent>
-          <mc:Choice Requires="wpg">
+          <mc:Choice Requires="wps">
             <w:drawing>
-              <wp:anchor distT="0" distB="0" distL="114300" distR="114300" simplePos="0" relativeHeight="251660288" behindDoc="0" locked="0" layoutInCell="1" hidden="0" allowOverlap="1" wp14:anchorId="2D2E5DD5" wp14:editId="66D28141">
+              <wp:anchor distT="0" distB="0" distL="114300" distR="114300" simplePos="0" relativeHeight="251660288" behindDoc="0" locked="0" layoutInCell="1" hidden="0" allowOverlap="1" wp14:anchorId="2D2E5DD5" wp14:editId="059B0F3C">
                 <wp:simplePos x="0" y="0"/>
                 <wp:positionH relativeFrom="column">
-                  <wp:posOffset>2434861</wp:posOffset>
+                  <wp:posOffset>4034790</wp:posOffset>
                 </wp:positionH>
                 <wp:positionV relativeFrom="paragraph">
-                  <wp:posOffset>451667</wp:posOffset>
+                  <wp:posOffset>464185</wp:posOffset>
                 </wp:positionV>
-                <wp:extent cx="957943" cy="12700"/>
+                <wp:extent cx="957943" cy="0"/>
                 <wp:effectExtent l="0" t="0" r="0" b="0"/>
                 <wp:wrapNone/>
                 <wp:docPr id="3" name="Straight Arrow Connector 3"/>
@@ -394,7 +374,7 @@
                       <wps:cNvCnPr/>
                       <wps:spPr>
                         <a:xfrm>
-                          <a:off x="4867029" y="3780000"/>
+                          <a:off x="0" y="0"/>
                           <a:ext cx="957943" cy="0"/>
                         </a:xfrm>
                         <a:prstGeom prst="straightConnector1">
@@ -415,53 +395,29 @@
                     </wps:wsp>
                   </a:graphicData>
                 </a:graphic>
+                <wp14:sizeRelV relativeFrom="margin">
+                  <wp14:pctHeight>0</wp14:pctHeight>
+                </wp14:sizeRelV>
               </wp:anchor>
             </w:drawing>
           </mc:Choice>
-          <mc:Fallback xmlns:cr="http://schemas.microsoft.com/office/comments/2020/reactions" xmlns="http://schemas.microsoft.com/office/tasks/2019/documenttasks" xmlns:dgm="http://schemas.openxmlformats.org/drawingml/2006/diagram" xmlns:lc="http://schemas.openxmlformats.org/drawingml/2006/lockedCanvas" xmlns:c="http://schemas.openxmlformats.org/drawingml/2006/chart" xmlns:pic="http://schemas.openxmlformats.org/drawingml/2006/picture" xmlns:a="http://schemas.openxmlformats.org/drawingml/2006/main" xmlns:sl="http://schemas.openxmlformats.org/schemaLibrary/2006/main">
-            <w:drawing>
-              <wp:anchor distT="0" distB="0" distL="114300" distR="114300" simplePos="0" relativeHeight="0" behindDoc="0" locked="0" layoutInCell="1" hidden="0" allowOverlap="1">
-                <wp:simplePos x="0" y="0"/>
-                <wp:positionH relativeFrom="column">
-                  <wp:posOffset>2434861</wp:posOffset>
-                </wp:positionH>
-                <wp:positionV relativeFrom="paragraph">
-                  <wp:posOffset>451667</wp:posOffset>
-                </wp:positionV>
-                <wp:extent cx="957943" cy="12700"/>
-                <wp:effectExtent l="0" t="0" r="0" b="0"/>
-                <wp:wrapNone/>
-                <wp:docPr id="3" name="image3.png"/>
-                <a:graphic>
-                  <a:graphicData uri="http://schemas.openxmlformats.org/drawingml/2006/picture">
-                    <pic:pic>
-                      <pic:nvPicPr>
-                        <pic:cNvPr id="0" name="image3.png"/>
-                        <pic:cNvPicPr preferRelativeResize="0"/>
-                      </pic:nvPicPr>
-                      <pic:blipFill>
-                        <a:blip r:embed="rId6"/>
-                        <a:srcRect/>
-                        <a:stretch>
-                          <a:fillRect/>
-                        </a:stretch>
-                      </pic:blipFill>
-                      <pic:spPr>
-                        <a:xfrm>
-                          <a:off x="0" y="0"/>
-                          <a:ext cx="957943" cy="12700"/>
-                        </a:xfrm>
-                        <a:prstGeom prst="rect"/>
-                        <a:ln/>
-                      </pic:spPr>
-                    </pic:pic>
-                  </a:graphicData>
-                </a:graphic>
-              </wp:anchor>
-            </w:drawing>
+          <mc:Fallback>
+            <w:pict>
+              <v:shape w14:anchorId="4EAE6D7C" id="Straight Arrow Connector 3" o:spid="_x0000_s1026" type="#_x0000_t32" style="position:absolute;margin-left:317.7pt;margin-top:36.55pt;width:75.45pt;height:0;z-index:251660288;visibility:visible;mso-wrap-style:square;mso-height-percent:0;mso-wrap-distance-left:9pt;mso-wrap-distance-top:0;mso-wrap-distance-right:9pt;mso-wrap-distance-bottom:0;mso-position-horizontal:absolute;mso-position-horizontal-relative:text;mso-position-vertical:absolute;mso-position-vertical-relative:text;mso-height-percent:0;mso-height-relative:margin" o:gfxdata="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" strokecolor="black [3200]">
+                <v:stroke startarrowwidth="narrow" startarrowlength="short" endarrowwidth="narrow" endarrowlength="short" joinstyle="miter"/>
+              </v:shape>
+            </w:pict>
           </mc:Fallback>
         </mc:AlternateContent>
       </w:r>
+      <w:r>
+        <w:rPr>
+          <w:lang w:val="en-US"/>
+        </w:rPr>
+        <w:t>{reportTitle}</w:t>
+      </w:r>
+      <w:bookmarkStart w:id="0" w:name="_GoBack"/>
+      <w:bookmarkEnd w:id="0"/>
     </w:p>
     <w:p>
       <w:pPr>
@@ -475,14 +431,13 @@
     <w:tbl>
       <w:tblPr>
         <w:tblW w:w="13797" w:type="dxa"/>
-        <w:tblInd w:w="0" w:type="dxa"/>
         <w:tblBorders>
-          <w:top w:val="single" w:color="000000" w:themeColor="text1" w:sz="8" w:space="0"/>
-          <w:left w:val="single" w:color="000000" w:themeColor="text1" w:sz="8" w:space="0"/>
-          <w:bottom w:val="single" w:color="000000" w:themeColor="text1" w:sz="8" w:space="0"/>
-          <w:right w:val="single" w:color="000000" w:themeColor="text1" w:sz="8" w:space="0"/>
-          <w:insideH w:val="single" w:color="000000" w:themeColor="text1" w:sz="8" w:space="0"/>
-          <w:insideV w:val="single" w:color="000000" w:themeColor="text1" w:sz="8" w:space="0"/>
+          <w:top w:val="single" w:sz="8" w:space="0" w:color="000000" w:themeColor="text1"/>
+          <w:left w:val="single" w:sz="8" w:space="0" w:color="000000" w:themeColor="text1"/>
+          <w:bottom w:val="single" w:sz="8" w:space="0" w:color="000000" w:themeColor="text1"/>
+          <w:right w:val="single" w:sz="8" w:space="0" w:color="000000" w:themeColor="text1"/>
+          <w:insideH w:val="single" w:sz="8" w:space="0" w:color="000000" w:themeColor="text1"/>
+          <w:insideV w:val="single" w:sz="8" w:space="0" w:color="000000" w:themeColor="text1"/>
         </w:tblBorders>
         <w:tblLayout w:type="fixed"/>
         <w:tblLook w:val="0600" w:firstRow="0" w:lastRow="0" w:firstColumn="0" w:lastColumn="0" w:noHBand="1" w:noVBand="1"/>
@@ -677,7 +632,15 @@
                 <w:sz w:val="26"/>
                 <w:szCs w:val="26"/>
               </w:rPr>
-              <w:t>{FOR column IN columns}</w:t>
+              <w:t xml:space="preserve">{FOR column IN </w:t>
+            </w:r>
+            <w:r>
+              <w:rPr>
+                <w:b w:val="0"/>
+                <w:sz w:val="26"/>
+                <w:szCs w:val="26"/>
+              </w:rPr>
+              <w:t>columns}</w:t>
             </w:r>
           </w:p>
         </w:tc>
@@ -809,7 +772,6 @@
     <w:tbl>
       <w:tblPr>
         <w:tblW w:w="14032" w:type="dxa"/>
-        <w:tblInd w:w="0" w:type="dxa"/>
         <w:tblBorders>
           <w:top w:val="nil"/>
           <w:left w:val="nil"/>
@@ -833,14 +795,11 @@
         <w:tc>
           <w:tcPr>
             <w:tcW w:w="4677" w:type="dxa"/>
-            <w:tcMar/>
           </w:tcPr>
           <w:p>
             <w:pPr>
-              <w:pStyle w:val="Normal"/>
-              <w:rPr>
-                <w:b w:val="0"/>
-                <w:bCs w:val="0"/>
+              <w:rPr>
+                <w:b w:val="0"/>
                 <w:sz w:val="26"/>
                 <w:szCs w:val="26"/>
               </w:rPr>
@@ -850,7 +809,6 @@
         <w:tc>
           <w:tcPr>
             <w:tcW w:w="4677" w:type="dxa"/>
-            <w:tcMar/>
           </w:tcPr>
           <w:p>
             <w:pPr>
@@ -865,7 +823,6 @@
         <w:tc>
           <w:tcPr>
             <w:tcW w:w="4678" w:type="dxa"/>
-            <w:tcMar/>
           </w:tcPr>
           <w:p>
             <w:pPr>
@@ -980,11 +937,11 @@
 </file>
 
 <file path=word/styles.xml><?xml version="1.0" encoding="utf-8"?>
-<w:styles xmlns:mc="http://schemas.openxmlformats.org/markup-compatibility/2006" xmlns:r="http://schemas.openxmlformats.org/officeDocument/2006/relationships" xmlns:w="http://schemas.openxmlformats.org/wordprocessingml/2006/main" xmlns:w14="http://schemas.microsoft.com/office/word/2010/wordml" xmlns:w15="http://schemas.microsoft.com/office/word/2012/wordml" xmlns:w16cex="http://schemas.microsoft.com/office/word/2018/wordml/cex" xmlns:w16cid="http://schemas.microsoft.com/office/word/2016/wordml/cid" xmlns:w16="http://schemas.microsoft.com/office/word/2018/wordml" xmlns:w16du="http://schemas.microsoft.com/office/word/2023/wordml/word16du" xmlns:w16sdtdh="http://schemas.microsoft.com/office/word/2020/wordml/sdtdatahash" xmlns:w16sdtfl="http://schemas.microsoft.com/office/word/2024/wordml/sdtformatlock" xmlns:w16se="http://schemas.microsoft.com/office/word/2015/wordml/symex" mc:Ignorable="w14 w15 w16se w16cid w16 w16cex w16sdtdh w16sdtfl w16du">
+<w:styles xmlns:mc="http://schemas.openxmlformats.org/markup-compatibility/2006" xmlns:r="http://schemas.openxmlformats.org/officeDocument/2006/relationships" xmlns:w="http://schemas.openxmlformats.org/wordprocessingml/2006/main" xmlns:w14="http://schemas.microsoft.com/office/word/2010/wordml" xmlns:w15="http://schemas.microsoft.com/office/word/2012/wordml" xmlns:w16cid="http://schemas.microsoft.com/office/word/2016/wordml/cid" xmlns:w16se="http://schemas.microsoft.com/office/word/2015/wordml/symex" mc:Ignorable="w14 w15 w16se w16cid">
   <w:docDefaults>
     <w:rPrDefault>
       <w:rPr>
-        <w:rFonts w:ascii="Times New Roman" w:hAnsi="Times New Roman" w:eastAsia="Times New Roman" w:cs="Times New Roman"/>
+        <w:rFonts w:ascii="Times New Roman" w:eastAsia="Times New Roman" w:hAnsi="Times New Roman" w:cs="Times New Roman"/>
         <w:b/>
         <w:sz w:val="28"/>
         <w:szCs w:val="28"/>
@@ -993,17 +950,17 @@
     </w:rPrDefault>
     <w:pPrDefault/>
   </w:docDefaults>
-  <w:latentStyles w:defLockedState="0" w:defUIPriority="99" w:defSemiHidden="0" w:defUnhideWhenUsed="0" w:defQFormat="0" w:count="376">
+  <w:latentStyles w:defLockedState="0" w:defUIPriority="99" w:defSemiHidden="0" w:defUnhideWhenUsed="0" w:defQFormat="0" w:count="375">
     <w:lsdException w:name="Normal" w:uiPriority="0" w:qFormat="1"/>
     <w:lsdException w:name="heading 1" w:uiPriority="9" w:qFormat="1"/>
-    <w:lsdException w:name="heading 2" w:uiPriority="9" w:semiHidden="1" w:unhideWhenUsed="1" w:qFormat="1"/>
-    <w:lsdException w:name="heading 3" w:uiPriority="9" w:semiHidden="1" w:unhideWhenUsed="1" w:qFormat="1"/>
-    <w:lsdException w:name="heading 4" w:uiPriority="9" w:semiHidden="1" w:unhideWhenUsed="1" w:qFormat="1"/>
-    <w:lsdException w:name="heading 5" w:uiPriority="9" w:semiHidden="1" w:unhideWhenUsed="1" w:qFormat="1"/>
-    <w:lsdException w:name="heading 6" w:uiPriority="9" w:semiHidden="1" w:unhideWhenUsed="1" w:qFormat="1"/>
-    <w:lsdException w:name="heading 7" w:uiPriority="9" w:semiHidden="1" w:unhideWhenUsed="1" w:qFormat="1"/>
-    <w:lsdException w:name="heading 8" w:uiPriority="9" w:semiHidden="1" w:unhideWhenUsed="1" w:qFormat="1"/>
-    <w:lsdException w:name="heading 9" w:uiPriority="9" w:semiHidden="1" w:unhideWhenUsed="1" w:qFormat="1"/>
+    <w:lsdException w:name="heading 2" w:semiHidden="1" w:uiPriority="9" w:unhideWhenUsed="1" w:qFormat="1"/>
+    <w:lsdException w:name="heading 3" w:semiHidden="1" w:uiPriority="9" w:unhideWhenUsed="1" w:qFormat="1"/>
+    <w:lsdException w:name="heading 4" w:semiHidden="1" w:uiPriority="9" w:unhideWhenUsed="1" w:qFormat="1"/>
+    <w:lsdException w:name="heading 5" w:semiHidden="1" w:uiPriority="9" w:unhideWhenUsed="1" w:qFormat="1"/>
+    <w:lsdException w:name="heading 6" w:semiHidden="1" w:uiPriority="9" w:unhideWhenUsed="1" w:qFormat="1"/>
+    <w:lsdException w:name="heading 7" w:semiHidden="1" w:uiPriority="9" w:unhideWhenUsed="1" w:qFormat="1"/>
+    <w:lsdException w:name="heading 8" w:semiHidden="1" w:uiPriority="9" w:unhideWhenUsed="1" w:qFormat="1"/>
+    <w:lsdException w:name="heading 9" w:semiHidden="1" w:uiPriority="9" w:unhideWhenUsed="1" w:qFormat="1"/>
     <w:lsdException w:name="index 1" w:semiHidden="1" w:unhideWhenUsed="1"/>
     <w:lsdException w:name="index 2" w:semiHidden="1" w:unhideWhenUsed="1"/>
     <w:lsdException w:name="index 3" w:semiHidden="1" w:unhideWhenUsed="1"/>
@@ -1013,22 +970,22 @@
     <w:lsdException w:name="index 7" w:semiHidden="1" w:unhideWhenUsed="1"/>
     <w:lsdException w:name="index 8" w:semiHidden="1" w:unhideWhenUsed="1"/>
     <w:lsdException w:name="index 9" w:semiHidden="1" w:unhideWhenUsed="1"/>
-    <w:lsdException w:name="toc 1" w:uiPriority="39" w:semiHidden="1" w:unhideWhenUsed="1"/>
-    <w:lsdException w:name="toc 2" w:uiPriority="39" w:semiHidden="1" w:unhideWhenUsed="1"/>
-    <w:lsdException w:name="toc 3" w:uiPriority="39" w:semiHidden="1" w:unhideWhenUsed="1"/>
-    <w:lsdException w:name="toc 4" w:uiPriority="39" w:semiHidden="1" w:unhideWhenUsed="1"/>
-    <w:lsdException w:name="toc 5" w:uiPriority="39" w:semiHidden="1" w:unhideWhenUsed="1"/>
-    <w:lsdException w:name="toc 6" w:uiPriority="39" w:semiHidden="1" w:unhideWhenUsed="1"/>
-    <w:lsdException w:name="toc 7" w:uiPriority="39" w:semiHidden="1" w:unhideWhenUsed="1"/>
-    <w:lsdException w:name="toc 8" w:uiPriority="39" w:semiHidden="1" w:unhideWhenUsed="1"/>
-    <w:lsdException w:name="toc 9" w:uiPriority="39" w:semiHidden="1" w:unhideWhenUsed="1"/>
+    <w:lsdException w:name="toc 1" w:semiHidden="1" w:uiPriority="39" w:unhideWhenUsed="1"/>
+    <w:lsdException w:name="toc 2" w:semiHidden="1" w:uiPriority="39" w:unhideWhenUsed="1"/>
+    <w:lsdException w:name="toc 3" w:semiHidden="1" w:uiPriority="39" w:unhideWhenUsed="1"/>
+    <w:lsdException w:name="toc 4" w:semiHidden="1" w:uiPriority="39" w:unhideWhenUsed="1"/>
+    <w:lsdException w:name="toc 5" w:semiHidden="1" w:uiPriority="39" w:unhideWhenUsed="1"/>
+    <w:lsdException w:name="toc 6" w:semiHidden="1" w:uiPriority="39" w:unhideWhenUsed="1"/>
+    <w:lsdException w:name="toc 7" w:semiHidden="1" w:uiPriority="39" w:unhideWhenUsed="1"/>
+    <w:lsdException w:name="toc 8" w:semiHidden="1" w:uiPriority="39" w:unhideWhenUsed="1"/>
+    <w:lsdException w:name="toc 9" w:semiHidden="1" w:uiPriority="39" w:unhideWhenUsed="1"/>
     <w:lsdException w:name="Normal Indent" w:semiHidden="1" w:unhideWhenUsed="1"/>
     <w:lsdException w:name="footnote text" w:semiHidden="1" w:unhideWhenUsed="1"/>
     <w:lsdException w:name="annotation text" w:semiHidden="1" w:unhideWhenUsed="1"/>
     <w:lsdException w:name="header" w:semiHidden="1" w:unhideWhenUsed="1"/>
     <w:lsdException w:name="footer" w:semiHidden="1" w:unhideWhenUsed="1"/>
     <w:lsdException w:name="index heading" w:semiHidden="1" w:unhideWhenUsed="1"/>
-    <w:lsdException w:name="caption" w:uiPriority="35" w:semiHidden="1" w:unhideWhenUsed="1" w:qFormat="1"/>
+    <w:lsdException w:name="caption" w:semiHidden="1" w:uiPriority="35" w:unhideWhenUsed="1" w:qFormat="1"/>
     <w:lsdException w:name="table of figures" w:semiHidden="1" w:unhideWhenUsed="1"/>
     <w:lsdException w:name="envelope address" w:semiHidden="1" w:unhideWhenUsed="1"/>
     <w:lsdException w:name="envelope return" w:semiHidden="1" w:unhideWhenUsed="1"/>
@@ -1059,7 +1016,7 @@
     <w:lsdException w:name="Title" w:uiPriority="10" w:qFormat="1"/>
     <w:lsdException w:name="Closing" w:semiHidden="1" w:unhideWhenUsed="1"/>
     <w:lsdException w:name="Signature" w:semiHidden="1" w:unhideWhenUsed="1"/>
-    <w:lsdException w:name="Default Paragraph Font" w:uiPriority="1" w:semiHidden="1" w:unhideWhenUsed="1"/>
+    <w:lsdException w:name="Default Paragraph Font" w:semiHidden="1" w:uiPriority="1" w:unhideWhenUsed="1"/>
     <w:lsdException w:name="Body Text" w:semiHidden="1" w:unhideWhenUsed="1"/>
     <w:lsdException w:name="Body Text Indent" w:semiHidden="1" w:unhideWhenUsed="1"/>
     <w:lsdException w:name="List Continue" w:semiHidden="1" w:unhideWhenUsed="1"/>
@@ -1259,8 +1216,8 @@
     <w:lsdException w:name="Subtle Reference" w:uiPriority="31" w:qFormat="1"/>
     <w:lsdException w:name="Intense Reference" w:uiPriority="32" w:qFormat="1"/>
     <w:lsdException w:name="Book Title" w:uiPriority="33" w:qFormat="1"/>
-    <w:lsdException w:name="Bibliography" w:uiPriority="37" w:semiHidden="1" w:unhideWhenUsed="1"/>
-    <w:lsdException w:name="TOC Heading" w:uiPriority="39" w:semiHidden="1" w:unhideWhenUsed="1" w:qFormat="1"/>
+    <w:lsdException w:name="Bibliography" w:semiHidden="1" w:uiPriority="37" w:unhideWhenUsed="1"/>
+    <w:lsdException w:name="TOC Heading" w:semiHidden="1" w:uiPriority="39" w:unhideWhenUsed="1" w:qFormat="1"/>
     <w:lsdException w:name="Plain Table 1" w:uiPriority="41"/>
     <w:lsdException w:name="Plain Table 2" w:uiPriority="42"/>
     <w:lsdException w:name="Plain Table 3" w:uiPriority="43"/>
@@ -1369,9 +1326,8 @@
     <w:lsdException w:name="Smart Hyperlink" w:semiHidden="1" w:unhideWhenUsed="1"/>
     <w:lsdException w:name="Hashtag" w:semiHidden="1" w:unhideWhenUsed="1"/>
     <w:lsdException w:name="Unresolved Mention" w:semiHidden="1" w:unhideWhenUsed="1"/>
-    <w:lsdException w:name="Smart Link" w:semiHidden="1" w:unhideWhenUsed="1"/>
   </w:latentStyles>
-  <w:style w:type="paragraph" w:styleId="Normal" w:default="1">
+  <w:style w:type="paragraph" w:default="1" w:styleId="Normal">
     <w:name w:val="Normal"/>
     <w:qFormat/>
   </w:style>
@@ -1483,13 +1439,13 @@
       <w:szCs w:val="20"/>
     </w:rPr>
   </w:style>
-  <w:style w:type="character" w:styleId="DefaultParagraphFont" w:default="1">
+  <w:style w:type="character" w:default="1" w:styleId="DefaultParagraphFont">
     <w:name w:val="Default Paragraph Font"/>
     <w:uiPriority w:val="1"/>
     <w:semiHidden/>
     <w:unhideWhenUsed/>
   </w:style>
-  <w:style w:type="table" w:styleId="TableNormal" w:default="1">
+  <w:style w:type="table" w:default="1" w:styleId="TableNormal">
     <w:name w:val="Normal Table"/>
     <w:uiPriority w:val="99"/>
     <w:semiHidden/>
@@ -1504,13 +1460,13 @@
       </w:tblCellMar>
     </w:tblPr>
   </w:style>
-  <w:style w:type="numbering" w:styleId="NoList" w:default="1">
+  <w:style w:type="numbering" w:default="1" w:styleId="NoList">
     <w:name w:val="No List"/>
     <w:uiPriority w:val="99"/>
     <w:semiHidden/>
     <w:unhideWhenUsed/>
   </w:style>
-  <w:style w:type="table" w:styleId="TableNormal0" w:customStyle="1">
+  <w:style w:type="table" w:customStyle="1" w:styleId="TableNormal0">
     <w:name w:val="TableNormal"/>
     <w:tblPr>
       <w:tblCellMar>
@@ -1549,27 +1505,25 @@
       <w:spacing w:before="360" w:after="80"/>
     </w:pPr>
     <w:rPr>
-      <w:rFonts w:ascii="Georgia" w:hAnsi="Georgia" w:eastAsia="Georgia" w:cs="Georgia"/>
+      <w:rFonts w:ascii="Georgia" w:eastAsia="Georgia" w:hAnsi="Georgia" w:cs="Georgia"/>
       <w:i/>
       <w:color w:val="666666"/>
       <w:sz w:val="48"/>
       <w:szCs w:val="48"/>
     </w:rPr>
   </w:style>
-  <w:style w:type="table" w:styleId="a" w:customStyle="1">
+  <w:style w:type="table" w:customStyle="1" w:styleId="a">
     <w:basedOn w:val="TableNormal0"/>
     <w:tblPr>
       <w:tblStyleRowBandSize w:val="1"/>
       <w:tblStyleColBandSize w:val="1"/>
       <w:tblCellMar>
-        <w:top w:w="0" w:type="dxa"/>
         <w:left w:w="108" w:type="dxa"/>
-        <w:bottom w:w="0" w:type="dxa"/>
         <w:right w:w="108" w:type="dxa"/>
       </w:tblCellMar>
     </w:tblPr>
   </w:style>
-  <w:style w:type="table" w:styleId="a0" w:customStyle="1">
+  <w:style w:type="table" w:customStyle="1" w:styleId="a0">
     <w:basedOn w:val="TableNormal0"/>
     <w:tblPr>
       <w:tblStyleRowBandSize w:val="1"/>
@@ -1582,15 +1536,13 @@
       </w:tblCellMar>
     </w:tblPr>
   </w:style>
-  <w:style w:type="table" w:styleId="a1" w:customStyle="1">
+  <w:style w:type="table" w:customStyle="1" w:styleId="a1">
     <w:basedOn w:val="TableNormal0"/>
     <w:tblPr>
       <w:tblStyleRowBandSize w:val="1"/>
       <w:tblStyleColBandSize w:val="1"/>
       <w:tblCellMar>
-        <w:top w:w="0" w:type="dxa"/>
         <w:left w:w="108" w:type="dxa"/>
-        <w:bottom w:w="0" w:type="dxa"/>
         <w:right w:w="108" w:type="dxa"/>
       </w:tblCellMar>
     </w:tblPr>

</xml_diff>